<commit_message>
Refactored code and fix generate docx
</commit_message>
<xml_diff>
--- a/src/main/resources/docs/templates/template.docx
+++ b/src/main/resources/docs/templates/template.docx
@@ -239,7 +239,25 @@
           <w:sz w:val="24"/>
           <w:szCs w:val="24"/>
         </w:rPr>
-        <w:t>Про перезарахування навчальних</w:t>
+        <w:t xml:space="preserve">Про </w:t>
+      </w:r>
+      <w:proofErr w:type="spellStart"/>
+      <w:r>
+        <w:rPr>
+          <w:rFonts w:ascii="Times New Roman" w:hAnsi="Times New Roman" w:cs="Times New Roman"/>
+          <w:sz w:val="24"/>
+          <w:szCs w:val="24"/>
+        </w:rPr>
+        <w:t>перезарахування</w:t>
+      </w:r>
+      <w:proofErr w:type="spellEnd"/>
+      <w:r>
+        <w:rPr>
+          <w:rFonts w:ascii="Times New Roman" w:hAnsi="Times New Roman" w:cs="Times New Roman"/>
+          <w:sz w:val="24"/>
+          <w:szCs w:val="24"/>
+        </w:rPr>
+        <w:t xml:space="preserve"> навчальних</w:t>
       </w:r>
     </w:p>
     <w:p>
@@ -309,7 +327,25 @@
           <w:szCs w:val="24"/>
         </w:rPr>
         <w:tab/>
-        <w:t xml:space="preserve">Відповідно до п. 2.3 «Положення про порядок перезарахування навчальних дисциплін і визначення академічної різниці у Черкаському державному технологічному університеті», </w:t>
+        <w:t xml:space="preserve">Відповідно до п. 2.3 «Положення про порядок </w:t>
+      </w:r>
+      <w:proofErr w:type="spellStart"/>
+      <w:r>
+        <w:rPr>
+          <w:rFonts w:ascii="Times New Roman" w:hAnsi="Times New Roman" w:cs="Times New Roman"/>
+          <w:sz w:val="24"/>
+          <w:szCs w:val="24"/>
+        </w:rPr>
+        <w:t>перезарахування</w:t>
+      </w:r>
+      <w:proofErr w:type="spellEnd"/>
+      <w:r>
+        <w:rPr>
+          <w:rFonts w:ascii="Times New Roman" w:hAnsi="Times New Roman" w:cs="Times New Roman"/>
+          <w:sz w:val="24"/>
+          <w:szCs w:val="24"/>
+        </w:rPr>
+        <w:t xml:space="preserve"> навчальних дисциплін і визначення академічної різниці у Черкаському державному технологічному університеті», </w:t>
       </w:r>
     </w:p>
     <w:p>
@@ -353,15 +389,26 @@
           <w:rFonts w:ascii="Times New Roman" w:eastAsia="Calibri" w:hAnsi="Times New Roman" w:cs="Times New Roman"/>
           <w:sz w:val="24"/>
           <w:szCs w:val="24"/>
-        </w:rPr>
-      </w:pPr>
-      <w:r>
-        <w:rPr>
-          <w:rFonts w:ascii="Times New Roman" w:eastAsia="Calibri" w:hAnsi="Times New Roman" w:cs="Times New Roman"/>
-          <w:sz w:val="24"/>
-          <w:szCs w:val="24"/>
-        </w:rPr>
-        <w:t>Перезарахувати здобувач</w:t>
+          <w:lang w:val="en-US"/>
+        </w:rPr>
+      </w:pPr>
+      <w:proofErr w:type="spellStart"/>
+      <w:r>
+        <w:rPr>
+          <w:rFonts w:ascii="Times New Roman" w:eastAsia="Calibri" w:hAnsi="Times New Roman" w:cs="Times New Roman"/>
+          <w:sz w:val="24"/>
+          <w:szCs w:val="24"/>
+        </w:rPr>
+        <w:t>Перезарахувати</w:t>
+      </w:r>
+      <w:proofErr w:type="spellEnd"/>
+      <w:r>
+        <w:rPr>
+          <w:rFonts w:ascii="Times New Roman" w:eastAsia="Calibri" w:hAnsi="Times New Roman" w:cs="Times New Roman"/>
+          <w:sz w:val="24"/>
+          <w:szCs w:val="24"/>
+        </w:rPr>
+        <w:t xml:space="preserve"> здобувач</w:t>
       </w:r>
       <w:r>
         <w:rPr>
@@ -425,6 +472,22 @@
           <w:sz w:val="24"/>
           <w:szCs w:val="24"/>
         </w:rPr>
+        <w:t>освітнього рівня</w:t>
+      </w:r>
+      <w:r>
+        <w:rPr>
+          <w:rFonts w:ascii="Times New Roman" w:eastAsia="Calibri" w:hAnsi="Times New Roman" w:cs="Times New Roman"/>
+          <w:sz w:val="24"/>
+          <w:szCs w:val="24"/>
+        </w:rPr>
+        <w:t xml:space="preserve"> </w:t>
+      </w:r>
+      <w:r>
+        <w:rPr>
+          <w:rFonts w:ascii="Times New Roman" w:eastAsia="Calibri" w:hAnsi="Times New Roman" w:cs="Times New Roman"/>
+          <w:sz w:val="24"/>
+          <w:szCs w:val="24"/>
+        </w:rPr>
         <w:t>#</w:t>
       </w:r>
       <w:r>
@@ -442,7 +505,7 @@
           <w:sz w:val="24"/>
           <w:szCs w:val="24"/>
         </w:rPr>
-        <w:t xml:space="preserve"> освітнього рівня </w:t>
+        <w:t xml:space="preserve"> </w:t>
       </w:r>
       <w:r>
         <w:rPr>
@@ -533,6 +596,7 @@
         </w:rPr>
         <w:t>#</w:t>
       </w:r>
+      <w:proofErr w:type="spellStart"/>
       <w:r>
         <w:rPr>
           <w:rFonts w:ascii="Times New Roman" w:eastAsia="Calibri" w:hAnsi="Times New Roman" w:cs="Times New Roman"/>
@@ -541,6 +605,7 @@
         </w:rPr>
         <w:t>nameSpecialization</w:t>
       </w:r>
+      <w:proofErr w:type="spellEnd"/>
       <w:r>
         <w:rPr>
           <w:rFonts w:ascii="Times New Roman" w:eastAsia="Calibri" w:hAnsi="Times New Roman" w:cs="Times New Roman"/>
@@ -567,6 +632,7 @@
         </w:rPr>
         <w:t>#</w:t>
       </w:r>
+      <w:proofErr w:type="spellStart"/>
       <w:r>
         <w:rPr>
           <w:rFonts w:ascii="Times New Roman" w:eastAsia="Calibri" w:hAnsi="Times New Roman" w:cs="Times New Roman"/>
@@ -575,6 +641,7 @@
         </w:rPr>
         <w:t>nameSpeciality</w:t>
       </w:r>
+      <w:proofErr w:type="spellEnd"/>
       <w:r>
         <w:rPr>
           <w:rFonts w:ascii="Times New Roman" w:eastAsia="Calibri" w:hAnsi="Times New Roman" w:cs="Times New Roman"/>
@@ -583,6 +650,16 @@
         </w:rPr>
         <w:t>), наступні навчальні дисципліни:</w:t>
       </w:r>
+    </w:p>
+    <w:p>
+      <w:pPr>
+        <w:rPr>
+          <w:rFonts w:ascii="Times New Roman" w:eastAsia="Calibri" w:hAnsi="Times New Roman" w:cs="Times New Roman"/>
+          <w:sz w:val="24"/>
+          <w:szCs w:val="24"/>
+          <w:lang w:val="en-US"/>
+        </w:rPr>
+      </w:pPr>
     </w:p>
     <w:p>
       <w:pPr>
@@ -608,19 +685,19 @@
     <w:tbl>
       <w:tblPr>
         <w:tblStyle w:val="10"/>
-        <w:tblW w:w="0" w:type="auto"/>
+        <w:tblW w:w="5000" w:type="pct"/>
         <w:tblInd w:w="0" w:type="dxa"/>
         <w:tblLook w:val="04A0" w:firstRow="1" w:lastRow="0" w:firstColumn="1" w:lastColumn="0" w:noHBand="0" w:noVBand="1"/>
       </w:tblPr>
       <w:tblGrid>
-        <w:gridCol w:w="652"/>
-        <w:gridCol w:w="3212"/>
-        <w:gridCol w:w="576"/>
-        <w:gridCol w:w="662"/>
-        <w:gridCol w:w="901"/>
-        <w:gridCol w:w="1264"/>
-        <w:gridCol w:w="1482"/>
-        <w:gridCol w:w="669"/>
+        <w:gridCol w:w="795"/>
+        <w:gridCol w:w="3913"/>
+        <w:gridCol w:w="848"/>
+        <w:gridCol w:w="767"/>
+        <w:gridCol w:w="720"/>
+        <w:gridCol w:w="864"/>
+        <w:gridCol w:w="1140"/>
+        <w:gridCol w:w="864"/>
       </w:tblGrid>
       <w:tr>
         <w:trPr>
@@ -628,11 +705,12 @@
         </w:trPr>
         <w:tc>
           <w:tcPr>
-            <w:tcW w:w="598" w:type="dxa"/>
+            <w:tcW w:w="401" w:type="pct"/>
+            <w:vAlign w:val="center"/>
           </w:tcPr>
           <w:p>
             <w:pPr>
-              <w:jc w:val="left"/>
+              <w:jc w:val="center"/>
               <w:rPr>
                 <w:rFonts w:ascii="Times New Roman" w:hAnsi="Times New Roman"/>
                 <w:sz w:val="20"/>
@@ -659,7 +737,8 @@
         </w:tc>
         <w:tc>
           <w:tcPr>
-            <w:tcW w:w="3212" w:type="dxa"/>
+            <w:tcW w:w="1974" w:type="pct"/>
+            <w:vAlign w:val="center"/>
           </w:tcPr>
           <w:p>
             <w:pPr>
@@ -670,50 +749,59 @@
                 <w:szCs w:val="20"/>
               </w:rPr>
             </w:pPr>
-          </w:p>
-          <w:p>
-            <w:pPr>
-              <w:jc w:val="center"/>
-              <w:rPr>
-                <w:rFonts w:ascii="Times New Roman" w:hAnsi="Times New Roman"/>
-                <w:sz w:val="20"/>
-                <w:szCs w:val="20"/>
-              </w:rPr>
-            </w:pPr>
-          </w:p>
-          <w:p>
-            <w:pPr>
-              <w:jc w:val="center"/>
-              <w:rPr>
-                <w:rFonts w:ascii="Times New Roman" w:hAnsi="Times New Roman"/>
-                <w:sz w:val="20"/>
-                <w:szCs w:val="20"/>
-              </w:rPr>
-            </w:pPr>
-          </w:p>
-          <w:p>
-            <w:pPr>
-              <w:jc w:val="center"/>
-              <w:rPr>
-                <w:rFonts w:ascii="Times New Roman" w:hAnsi="Times New Roman"/>
-                <w:sz w:val="20"/>
-                <w:szCs w:val="20"/>
-              </w:rPr>
-            </w:pPr>
-            <w:r>
-              <w:rPr>
-                <w:rFonts w:ascii="Times New Roman" w:hAnsi="Times New Roman"/>
-                <w:sz w:val="20"/>
-                <w:szCs w:val="20"/>
-              </w:rPr>
-              <w:t>Назва навчальної дисципліни</w:t>
-            </w:r>
+            <w:proofErr w:type="spellStart"/>
+            <w:r>
+              <w:rPr>
+                <w:rFonts w:ascii="Times New Roman" w:hAnsi="Times New Roman"/>
+                <w:sz w:val="20"/>
+                <w:szCs w:val="20"/>
+              </w:rPr>
+              <w:t>Назва</w:t>
+            </w:r>
+            <w:proofErr w:type="spellEnd"/>
+            <w:r>
+              <w:rPr>
+                <w:rFonts w:ascii="Times New Roman" w:hAnsi="Times New Roman"/>
+                <w:sz w:val="20"/>
+                <w:szCs w:val="20"/>
+              </w:rPr>
+              <w:t xml:space="preserve"> </w:t>
+            </w:r>
+            <w:proofErr w:type="spellStart"/>
+            <w:r>
+              <w:rPr>
+                <w:rFonts w:ascii="Times New Roman" w:hAnsi="Times New Roman"/>
+                <w:sz w:val="20"/>
+                <w:szCs w:val="20"/>
+              </w:rPr>
+              <w:t>навчальної</w:t>
+            </w:r>
+            <w:proofErr w:type="spellEnd"/>
+            <w:r>
+              <w:rPr>
+                <w:rFonts w:ascii="Times New Roman" w:hAnsi="Times New Roman"/>
+                <w:sz w:val="20"/>
+                <w:szCs w:val="20"/>
+              </w:rPr>
+              <w:t xml:space="preserve"> </w:t>
+            </w:r>
+            <w:proofErr w:type="spellStart"/>
+            <w:r>
+              <w:rPr>
+                <w:rFonts w:ascii="Times New Roman" w:hAnsi="Times New Roman"/>
+                <w:sz w:val="20"/>
+                <w:szCs w:val="20"/>
+              </w:rPr>
+              <w:t>дисципліни</w:t>
+            </w:r>
+            <w:proofErr w:type="spellEnd"/>
           </w:p>
         </w:tc>
         <w:tc>
           <w:tcPr>
-            <w:tcW w:w="558" w:type="dxa"/>
+            <w:tcW w:w="428" w:type="pct"/>
             <w:textDirection w:val="btLr"/>
+            <w:vAlign w:val="center"/>
           </w:tcPr>
           <w:p>
             <w:pPr>
@@ -725,20 +813,49 @@
                 <w:szCs w:val="20"/>
               </w:rPr>
             </w:pPr>
-            <w:r>
-              <w:rPr>
-                <w:rFonts w:ascii="Times New Roman" w:hAnsi="Times New Roman"/>
-                <w:sz w:val="20"/>
-                <w:szCs w:val="20"/>
-              </w:rPr>
-              <w:t>Кількість кредитів ЄКТС</w:t>
+            <w:proofErr w:type="spellStart"/>
+            <w:r>
+              <w:rPr>
+                <w:rFonts w:ascii="Times New Roman" w:hAnsi="Times New Roman"/>
+                <w:sz w:val="20"/>
+                <w:szCs w:val="20"/>
+              </w:rPr>
+              <w:t>Кількість</w:t>
+            </w:r>
+            <w:proofErr w:type="spellEnd"/>
+            <w:r>
+              <w:rPr>
+                <w:rFonts w:ascii="Times New Roman" w:hAnsi="Times New Roman"/>
+                <w:sz w:val="20"/>
+                <w:szCs w:val="20"/>
+              </w:rPr>
+              <w:t xml:space="preserve"> </w:t>
+            </w:r>
+            <w:proofErr w:type="spellStart"/>
+            <w:r>
+              <w:rPr>
+                <w:rFonts w:ascii="Times New Roman" w:hAnsi="Times New Roman"/>
+                <w:sz w:val="20"/>
+                <w:szCs w:val="20"/>
+              </w:rPr>
+              <w:t>кредитів</w:t>
+            </w:r>
+            <w:proofErr w:type="spellEnd"/>
+            <w:r>
+              <w:rPr>
+                <w:rFonts w:ascii="Times New Roman" w:hAnsi="Times New Roman"/>
+                <w:sz w:val="20"/>
+                <w:szCs w:val="20"/>
+              </w:rPr>
+              <w:t xml:space="preserve"> ЄКТС</w:t>
             </w:r>
           </w:p>
         </w:tc>
         <w:tc>
           <w:tcPr>
-            <w:tcW w:w="662" w:type="dxa"/>
+            <w:tcW w:w="387" w:type="pct"/>
             <w:textDirection w:val="btLr"/>
+            <w:vAlign w:val="center"/>
           </w:tcPr>
           <w:p>
             <w:pPr>
@@ -750,20 +867,41 @@
                 <w:szCs w:val="20"/>
               </w:rPr>
             </w:pPr>
-            <w:r>
-              <w:rPr>
-                <w:rFonts w:ascii="Times New Roman" w:hAnsi="Times New Roman"/>
-                <w:sz w:val="20"/>
-                <w:szCs w:val="20"/>
-              </w:rPr>
-              <w:t>Обсяг годин</w:t>
-            </w:r>
+            <w:proofErr w:type="spellStart"/>
+            <w:r>
+              <w:rPr>
+                <w:rFonts w:ascii="Times New Roman" w:hAnsi="Times New Roman"/>
+                <w:sz w:val="20"/>
+                <w:szCs w:val="20"/>
+              </w:rPr>
+              <w:t>Обсяг</w:t>
+            </w:r>
+            <w:proofErr w:type="spellEnd"/>
+            <w:r>
+              <w:rPr>
+                <w:rFonts w:ascii="Times New Roman" w:hAnsi="Times New Roman"/>
+                <w:sz w:val="20"/>
+                <w:szCs w:val="20"/>
+              </w:rPr>
+              <w:t xml:space="preserve"> </w:t>
+            </w:r>
+            <w:proofErr w:type="spellStart"/>
+            <w:r>
+              <w:rPr>
+                <w:rFonts w:ascii="Times New Roman" w:hAnsi="Times New Roman"/>
+                <w:sz w:val="20"/>
+                <w:szCs w:val="20"/>
+              </w:rPr>
+              <w:t>годин</w:t>
+            </w:r>
+            <w:proofErr w:type="spellEnd"/>
           </w:p>
         </w:tc>
         <w:tc>
           <w:tcPr>
-            <w:tcW w:w="901" w:type="dxa"/>
+            <w:tcW w:w="363" w:type="pct"/>
             <w:textDirection w:val="btLr"/>
+            <w:vAlign w:val="center"/>
           </w:tcPr>
           <w:p>
             <w:pPr>
@@ -775,6 +913,7 @@
                 <w:szCs w:val="20"/>
               </w:rPr>
             </w:pPr>
+            <w:proofErr w:type="spellStart"/>
             <w:r>
               <w:rPr>
                 <w:rFonts w:ascii="Times New Roman" w:hAnsi="Times New Roman"/>
@@ -783,12 +922,14 @@
               </w:rPr>
               <w:t>Семестр</w:t>
             </w:r>
+            <w:proofErr w:type="spellEnd"/>
           </w:p>
         </w:tc>
         <w:tc>
           <w:tcPr>
-            <w:tcW w:w="1264" w:type="dxa"/>
+            <w:tcW w:w="436" w:type="pct"/>
             <w:textDirection w:val="btLr"/>
+            <w:vAlign w:val="center"/>
           </w:tcPr>
           <w:p>
             <w:pPr>
@@ -800,20 +941,41 @@
                 <w:szCs w:val="20"/>
               </w:rPr>
             </w:pPr>
-            <w:r>
-              <w:rPr>
-                <w:rFonts w:ascii="Times New Roman" w:hAnsi="Times New Roman"/>
-                <w:sz w:val="20"/>
-                <w:szCs w:val="20"/>
-              </w:rPr>
-              <w:t>Контрольний захід</w:t>
-            </w:r>
+            <w:proofErr w:type="spellStart"/>
+            <w:r>
+              <w:rPr>
+                <w:rFonts w:ascii="Times New Roman" w:hAnsi="Times New Roman"/>
+                <w:sz w:val="20"/>
+                <w:szCs w:val="20"/>
+              </w:rPr>
+              <w:t>Контрольний</w:t>
+            </w:r>
+            <w:proofErr w:type="spellEnd"/>
+            <w:r>
+              <w:rPr>
+                <w:rFonts w:ascii="Times New Roman" w:hAnsi="Times New Roman"/>
+                <w:sz w:val="20"/>
+                <w:szCs w:val="20"/>
+              </w:rPr>
+              <w:t xml:space="preserve"> </w:t>
+            </w:r>
+            <w:proofErr w:type="spellStart"/>
+            <w:r>
+              <w:rPr>
+                <w:rFonts w:ascii="Times New Roman" w:hAnsi="Times New Roman"/>
+                <w:sz w:val="20"/>
+                <w:szCs w:val="20"/>
+              </w:rPr>
+              <w:t>захід</w:t>
+            </w:r>
+            <w:proofErr w:type="spellEnd"/>
           </w:p>
         </w:tc>
         <w:tc>
           <w:tcPr>
-            <w:tcW w:w="1482" w:type="dxa"/>
+            <w:tcW w:w="575" w:type="pct"/>
             <w:textDirection w:val="btLr"/>
+            <w:vAlign w:val="center"/>
           </w:tcPr>
           <w:p>
             <w:pPr>
@@ -825,20 +987,77 @@
                 <w:szCs w:val="20"/>
               </w:rPr>
             </w:pPr>
-            <w:r>
-              <w:rPr>
-                <w:rFonts w:ascii="Times New Roman" w:hAnsi="Times New Roman"/>
-                <w:sz w:val="20"/>
-                <w:szCs w:val="20"/>
-              </w:rPr>
-              <w:t>Оцінка за традиційною шкалою</w:t>
-            </w:r>
+            <w:proofErr w:type="spellStart"/>
+            <w:r>
+              <w:rPr>
+                <w:rFonts w:ascii="Times New Roman" w:hAnsi="Times New Roman"/>
+                <w:sz w:val="20"/>
+                <w:szCs w:val="20"/>
+              </w:rPr>
+              <w:t>Оцінка</w:t>
+            </w:r>
+            <w:proofErr w:type="spellEnd"/>
+            <w:r>
+              <w:rPr>
+                <w:rFonts w:ascii="Times New Roman" w:hAnsi="Times New Roman"/>
+                <w:sz w:val="20"/>
+                <w:szCs w:val="20"/>
+              </w:rPr>
+              <w:t xml:space="preserve"> </w:t>
+            </w:r>
+            <w:proofErr w:type="spellStart"/>
+            <w:r>
+              <w:rPr>
+                <w:rFonts w:ascii="Times New Roman" w:hAnsi="Times New Roman"/>
+                <w:sz w:val="20"/>
+                <w:szCs w:val="20"/>
+              </w:rPr>
+              <w:t>за</w:t>
+            </w:r>
+            <w:proofErr w:type="spellEnd"/>
+            <w:r>
+              <w:rPr>
+                <w:rFonts w:ascii="Times New Roman" w:hAnsi="Times New Roman"/>
+                <w:sz w:val="20"/>
+                <w:szCs w:val="20"/>
+              </w:rPr>
+              <w:t xml:space="preserve"> </w:t>
+            </w:r>
+            <w:proofErr w:type="spellStart"/>
+            <w:r>
+              <w:rPr>
+                <w:rFonts w:ascii="Times New Roman" w:hAnsi="Times New Roman"/>
+                <w:sz w:val="20"/>
+                <w:szCs w:val="20"/>
+              </w:rPr>
+              <w:t>традиційною</w:t>
+            </w:r>
+            <w:proofErr w:type="spellEnd"/>
+            <w:r>
+              <w:rPr>
+                <w:rFonts w:ascii="Times New Roman" w:hAnsi="Times New Roman"/>
+                <w:sz w:val="20"/>
+                <w:szCs w:val="20"/>
+              </w:rPr>
+              <w:t xml:space="preserve"> </w:t>
+            </w:r>
+            <w:proofErr w:type="spellStart"/>
+            <w:r>
+              <w:rPr>
+                <w:rFonts w:ascii="Times New Roman" w:hAnsi="Times New Roman"/>
+                <w:sz w:val="20"/>
+                <w:szCs w:val="20"/>
+              </w:rPr>
+              <w:t>шкалою</w:t>
+            </w:r>
+            <w:proofErr w:type="spellEnd"/>
           </w:p>
         </w:tc>
         <w:tc>
           <w:tcPr>
-            <w:tcW w:w="669" w:type="dxa"/>
+            <w:tcW w:w="436" w:type="pct"/>
             <w:textDirection w:val="btLr"/>
+            <w:vAlign w:val="center"/>
           </w:tcPr>
           <w:p>
             <w:pPr>
@@ -850,27 +1069,84 @@
                 <w:szCs w:val="20"/>
               </w:rPr>
             </w:pPr>
-            <w:r>
-              <w:rPr>
-                <w:rFonts w:ascii="Times New Roman" w:hAnsi="Times New Roman"/>
-                <w:sz w:val="20"/>
-                <w:szCs w:val="20"/>
-              </w:rPr>
-              <w:t>Оцінка за 100- бальною шкалою</w:t>
-            </w:r>
+            <w:proofErr w:type="spellStart"/>
+            <w:r>
+              <w:rPr>
+                <w:rFonts w:ascii="Times New Roman" w:hAnsi="Times New Roman"/>
+                <w:sz w:val="20"/>
+                <w:szCs w:val="20"/>
+              </w:rPr>
+              <w:t>Оцінка</w:t>
+            </w:r>
+            <w:proofErr w:type="spellEnd"/>
+            <w:r>
+              <w:rPr>
+                <w:rFonts w:ascii="Times New Roman" w:hAnsi="Times New Roman"/>
+                <w:sz w:val="20"/>
+                <w:szCs w:val="20"/>
+              </w:rPr>
+              <w:t xml:space="preserve"> </w:t>
+            </w:r>
+            <w:proofErr w:type="spellStart"/>
+            <w:r>
+              <w:rPr>
+                <w:rFonts w:ascii="Times New Roman" w:hAnsi="Times New Roman"/>
+                <w:sz w:val="20"/>
+                <w:szCs w:val="20"/>
+              </w:rPr>
+              <w:t>за</w:t>
+            </w:r>
+            <w:proofErr w:type="spellEnd"/>
+            <w:r>
+              <w:rPr>
+                <w:rFonts w:ascii="Times New Roman" w:hAnsi="Times New Roman"/>
+                <w:sz w:val="20"/>
+                <w:szCs w:val="20"/>
+              </w:rPr>
+              <w:t xml:space="preserve"> 100- </w:t>
+            </w:r>
+            <w:proofErr w:type="spellStart"/>
+            <w:r>
+              <w:rPr>
+                <w:rFonts w:ascii="Times New Roman" w:hAnsi="Times New Roman"/>
+                <w:sz w:val="20"/>
+                <w:szCs w:val="20"/>
+              </w:rPr>
+              <w:t>бальною</w:t>
+            </w:r>
+            <w:proofErr w:type="spellEnd"/>
+            <w:r>
+              <w:rPr>
+                <w:rFonts w:ascii="Times New Roman" w:hAnsi="Times New Roman"/>
+                <w:sz w:val="20"/>
+                <w:szCs w:val="20"/>
+              </w:rPr>
+              <w:t xml:space="preserve"> </w:t>
+            </w:r>
+            <w:proofErr w:type="spellStart"/>
+            <w:r>
+              <w:rPr>
+                <w:rFonts w:ascii="Times New Roman" w:hAnsi="Times New Roman"/>
+                <w:sz w:val="20"/>
+                <w:szCs w:val="20"/>
+              </w:rPr>
+              <w:t>шкалою</w:t>
+            </w:r>
+            <w:proofErr w:type="spellEnd"/>
           </w:p>
         </w:tc>
       </w:tr>
       <w:tr>
         <w:tc>
           <w:tcPr>
-            <w:tcW w:w="598" w:type="dxa"/>
+            <w:tcW w:w="401" w:type="pct"/>
             <w:tcBorders>
               <w:top w:val="single" w:sz="4" w:space="0" w:color="auto"/>
               <w:left w:val="single" w:sz="4" w:space="0" w:color="auto"/>
               <w:bottom w:val="single" w:sz="4" w:space="0" w:color="auto"/>
               <w:right w:val="single" w:sz="4" w:space="0" w:color="auto"/>
             </w:tcBorders>
+            <w:vAlign w:val="center"/>
           </w:tcPr>
           <w:p>
             <w:pPr>
@@ -894,13 +1170,14 @@
         </w:tc>
         <w:tc>
           <w:tcPr>
-            <w:tcW w:w="3212" w:type="dxa"/>
+            <w:tcW w:w="1974" w:type="pct"/>
             <w:tcBorders>
               <w:top w:val="single" w:sz="4" w:space="0" w:color="auto"/>
               <w:left w:val="single" w:sz="4" w:space="0" w:color="auto"/>
               <w:bottom w:val="single" w:sz="4" w:space="0" w:color="auto"/>
               <w:right w:val="single" w:sz="4" w:space="0" w:color="auto"/>
             </w:tcBorders>
+            <w:vAlign w:val="center"/>
             <w:hideMark/>
           </w:tcPr>
           <w:p>
@@ -924,18 +1201,19 @@
         </w:tc>
         <w:tc>
           <w:tcPr>
-            <w:tcW w:w="558" w:type="dxa"/>
+            <w:tcW w:w="428" w:type="pct"/>
             <w:tcBorders>
               <w:top w:val="single" w:sz="4" w:space="0" w:color="auto"/>
               <w:left w:val="single" w:sz="4" w:space="0" w:color="auto"/>
               <w:bottom w:val="single" w:sz="4" w:space="0" w:color="auto"/>
               <w:right w:val="single" w:sz="4" w:space="0" w:color="auto"/>
             </w:tcBorders>
+            <w:vAlign w:val="center"/>
             <w:hideMark/>
           </w:tcPr>
           <w:p>
             <w:pPr>
-              <w:jc w:val="center"/>
+              <w:jc w:val="left"/>
               <w:rPr>
                 <w:rFonts w:ascii="Times New Roman" w:hAnsi="Times New Roman"/>
                 <w:sz w:val="24"/>
@@ -954,18 +1232,19 @@
         </w:tc>
         <w:tc>
           <w:tcPr>
-            <w:tcW w:w="662" w:type="dxa"/>
+            <w:tcW w:w="387" w:type="pct"/>
             <w:tcBorders>
               <w:top w:val="single" w:sz="4" w:space="0" w:color="auto"/>
               <w:left w:val="single" w:sz="4" w:space="0" w:color="auto"/>
               <w:bottom w:val="single" w:sz="4" w:space="0" w:color="auto"/>
               <w:right w:val="single" w:sz="4" w:space="0" w:color="auto"/>
             </w:tcBorders>
+            <w:vAlign w:val="center"/>
             <w:hideMark/>
           </w:tcPr>
           <w:p>
             <w:pPr>
-              <w:jc w:val="center"/>
+              <w:jc w:val="left"/>
               <w:rPr>
                 <w:rFonts w:ascii="Times New Roman" w:hAnsi="Times New Roman"/>
                 <w:sz w:val="24"/>
@@ -984,18 +1263,19 @@
         </w:tc>
         <w:tc>
           <w:tcPr>
-            <w:tcW w:w="901" w:type="dxa"/>
+            <w:tcW w:w="363" w:type="pct"/>
             <w:tcBorders>
               <w:top w:val="single" w:sz="4" w:space="0" w:color="auto"/>
               <w:left w:val="single" w:sz="4" w:space="0" w:color="auto"/>
               <w:bottom w:val="single" w:sz="4" w:space="0" w:color="auto"/>
               <w:right w:val="single" w:sz="4" w:space="0" w:color="auto"/>
             </w:tcBorders>
+            <w:vAlign w:val="center"/>
             <w:hideMark/>
           </w:tcPr>
           <w:p>
             <w:pPr>
-              <w:jc w:val="center"/>
+              <w:jc w:val="left"/>
               <w:rPr>
                 <w:rFonts w:ascii="Times New Roman" w:hAnsi="Times New Roman"/>
                 <w:sz w:val="24"/>
@@ -1014,18 +1294,19 @@
         </w:tc>
         <w:tc>
           <w:tcPr>
-            <w:tcW w:w="1264" w:type="dxa"/>
+            <w:tcW w:w="436" w:type="pct"/>
             <w:tcBorders>
               <w:top w:val="single" w:sz="4" w:space="0" w:color="auto"/>
               <w:left w:val="single" w:sz="4" w:space="0" w:color="auto"/>
               <w:bottom w:val="single" w:sz="4" w:space="0" w:color="auto"/>
               <w:right w:val="single" w:sz="4" w:space="0" w:color="auto"/>
             </w:tcBorders>
+            <w:vAlign w:val="center"/>
             <w:hideMark/>
           </w:tcPr>
           <w:p>
             <w:pPr>
-              <w:jc w:val="center"/>
+              <w:jc w:val="left"/>
               <w:rPr>
                 <w:rFonts w:ascii="Times New Roman" w:hAnsi="Times New Roman"/>
                 <w:sz w:val="24"/>
@@ -1044,18 +1325,19 @@
         </w:tc>
         <w:tc>
           <w:tcPr>
-            <w:tcW w:w="1482" w:type="dxa"/>
+            <w:tcW w:w="575" w:type="pct"/>
             <w:tcBorders>
               <w:top w:val="single" w:sz="4" w:space="0" w:color="auto"/>
               <w:left w:val="single" w:sz="4" w:space="0" w:color="auto"/>
               <w:bottom w:val="single" w:sz="4" w:space="0" w:color="auto"/>
               <w:right w:val="single" w:sz="4" w:space="0" w:color="auto"/>
             </w:tcBorders>
+            <w:vAlign w:val="center"/>
             <w:hideMark/>
           </w:tcPr>
           <w:p>
             <w:pPr>
-              <w:jc w:val="center"/>
+              <w:jc w:val="left"/>
               <w:rPr>
                 <w:rFonts w:ascii="Times New Roman" w:hAnsi="Times New Roman"/>
                 <w:sz w:val="24"/>
@@ -1074,18 +1356,19 @@
         </w:tc>
         <w:tc>
           <w:tcPr>
-            <w:tcW w:w="669" w:type="dxa"/>
+            <w:tcW w:w="436" w:type="pct"/>
             <w:tcBorders>
               <w:top w:val="single" w:sz="4" w:space="0" w:color="auto"/>
               <w:left w:val="single" w:sz="4" w:space="0" w:color="auto"/>
               <w:bottom w:val="single" w:sz="4" w:space="0" w:color="auto"/>
               <w:right w:val="single" w:sz="4" w:space="0" w:color="auto"/>
             </w:tcBorders>
+            <w:vAlign w:val="center"/>
             <w:hideMark/>
           </w:tcPr>
           <w:p>
             <w:pPr>
-              <w:jc w:val="center"/>
+              <w:jc w:val="left"/>
               <w:rPr>
                 <w:rFonts w:ascii="Times New Roman" w:hAnsi="Times New Roman"/>
                 <w:sz w:val="24"/>

</xml_diff>